<commit_message>
fix(orientacion): Word de remisión: escudo real (el run del marcador lleva rPr), título simple (Formato 005 solo Pestalozziano), RC/TI/CC inferido por edad si falta, teléfonos (+57) y todos los acudientes, destinos Dirección de grupo/Coordinación/Orientación, sin ROL, atendida por con cargo real, recorrido y seguimiento
</commit_message>
<xml_diff>
--- a/public/remision_005_template.docx
+++ b/public/remision_005_template.docx
@@ -83,6 +83,7 @@
         <w:tc>
           <w:tcPr>
             <w:tcW w:type="dxa" w:w="3118"/>
+            <w:vAlign w:val="center"/>
           </w:tcPr>
           <w:p>
             <w:pPr>
@@ -92,46 +93,15 @@
             <w:r>
               <w:rPr>
                 <w:b/>
-                <w:sz w:val="18"/>
+                <w:sz w:val="20"/>
               </w:rPr>
-              <w:t>FORMATO 005</w:t>
-            </w:r>
-            <w:r>
-              <w:br/>
-            </w:r>
-            <w:r>
-              <w:rPr>
-                <w:b/>
-                <w:sz w:val="18"/>
-              </w:rPr>
-              <w:t>DE REMISIÓN ESCOLAR OTRO</w:t>
-            </w:r>
-            <w:r>
-              <w:br/>
-            </w:r>
-            <w:r>
-              <w:rPr>
-                <w:b/>
-                <w:sz w:val="18"/>
-              </w:rPr>
-              <w:t>DOCENTE/DG/ORIENTACIÓN</w:t>
+              <w:t>{TITULO_FORMATO}</w:t>
             </w:r>
           </w:p>
         </w:tc>
       </w:tr>
     </w:tbl>
-    <w:p>
-      <w:pPr>
-        <w:jc w:val="center"/>
-      </w:pPr>
-      <w:r>
-        <w:rPr>
-          <w:b/>
-          <w:sz w:val="20"/>
-        </w:rPr>
-        <w:t>FORMATO 005: REMISIÓN DE OTRO DOCENTE / DIRECTOR DE GRUPO / ORIENTACIÓN ESCOLAR</w:t>
-      </w:r>
-    </w:p>
+    <w:p/>
     <w:tbl>
       <w:tblPr>
         <w:tblW w:type="auto" w:w="0"/>
@@ -358,7 +328,7 @@
                 <w:b/>
                 <w:sz w:val="18"/>
               </w:rPr>
-              <w:t>NOMBRE DEL ACUDIENTE</w:t>
+              <w:t>ACUDIENTE(S) Y TELÉFONO</w:t>
             </w:r>
           </w:p>
         </w:tc>
@@ -391,7 +361,7 @@
                 <w:b/>
                 <w:sz w:val="18"/>
               </w:rPr>
-              <w:t>TELÉFONO DE CONTACTO</w:t>
+              <w:t>TELÉFONO DEL ESTUDIANTE</w:t>
             </w:r>
           </w:p>
         </w:tc>
@@ -499,15 +469,14 @@
         </w:tblBorders>
       </w:tblPr>
       <w:tblGrid>
-        <w:gridCol w:w="2635"/>
-        <w:gridCol w:w="2635"/>
-        <w:gridCol w:w="2635"/>
-        <w:gridCol w:w="2635"/>
+        <w:gridCol w:w="3513"/>
+        <w:gridCol w:w="3513"/>
+        <w:gridCol w:w="3513"/>
       </w:tblGrid>
       <w:tr>
         <w:tc>
           <w:tcPr>
-            <w:tcW w:type="dxa" w:w="2635"/>
+            <w:tcW w:type="dxa" w:w="3513"/>
           </w:tcPr>
           <w:p>
             <w:pPr>
@@ -519,13 +488,31 @@
                 <w:b/>
                 <w:sz w:val="16"/>
               </w:rPr>
-              <w:t>DIRECTOR DE GRUPO</w:t>
+              <w:t>DIRECCIÓN DE GRUPO</w:t>
             </w:r>
           </w:p>
         </w:tc>
         <w:tc>
           <w:tcPr>
-            <w:tcW w:type="dxa" w:w="2635"/>
+            <w:tcW w:type="dxa" w:w="3513"/>
+          </w:tcPr>
+          <w:p>
+            <w:pPr>
+              <w:jc w:val="center"/>
+            </w:pPr>
+            <w:r/>
+            <w:r>
+              <w:rPr>
+                <w:b/>
+                <w:sz w:val="16"/>
+              </w:rPr>
+              <w:t>COORDINACIÓN</w:t>
+            </w:r>
+          </w:p>
+        </w:tc>
+        <w:tc>
+          <w:tcPr>
+            <w:tcW w:type="dxa" w:w="3513"/>
           </w:tcPr>
           <w:p>
             <w:pPr>
@@ -541,47 +528,11 @@
             </w:r>
           </w:p>
         </w:tc>
-        <w:tc>
-          <w:tcPr>
-            <w:tcW w:type="dxa" w:w="2635"/>
-          </w:tcPr>
-          <w:p>
-            <w:pPr>
-              <w:jc w:val="center"/>
-            </w:pPr>
-            <w:r/>
-            <w:r>
-              <w:rPr>
-                <w:b/>
-                <w:sz w:val="16"/>
-              </w:rPr>
-              <w:t>DOCENTE</w:t>
-            </w:r>
-          </w:p>
-        </w:tc>
-        <w:tc>
-          <w:tcPr>
-            <w:tcW w:type="dxa" w:w="2635"/>
-          </w:tcPr>
-          <w:p>
-            <w:pPr>
-              <w:jc w:val="center"/>
-            </w:pPr>
-            <w:r/>
-            <w:r>
-              <w:rPr>
-                <w:b/>
-                <w:sz w:val="16"/>
-              </w:rPr>
-              <w:t>OTRO ¿CUÁL?</w:t>
-            </w:r>
-          </w:p>
-        </w:tc>
       </w:tr>
       <w:tr>
         <w:tc>
           <w:tcPr>
-            <w:tcW w:type="dxa" w:w="2635"/>
+            <w:tcW w:type="dxa" w:w="3513"/>
           </w:tcPr>
           <w:p>
             <w:pPr>
@@ -599,7 +550,25 @@
         </w:tc>
         <w:tc>
           <w:tcPr>
-            <w:tcW w:type="dxa" w:w="2635"/>
+            <w:tcW w:type="dxa" w:w="3513"/>
+          </w:tcPr>
+          <w:p>
+            <w:pPr>
+              <w:jc w:val="center"/>
+            </w:pPr>
+            <w:r/>
+            <w:r>
+              <w:rPr>
+                <w:b w:val="0"/>
+                <w:sz w:val="24"/>
+              </w:rPr>
+              <w:t>{X_COORD}</w:t>
+            </w:r>
+          </w:p>
+        </w:tc>
+        <w:tc>
+          <w:tcPr>
+            <w:tcW w:type="dxa" w:w="3513"/>
           </w:tcPr>
           <w:p>
             <w:pPr>
@@ -612,53 +581,6 @@
                 <w:sz w:val="24"/>
               </w:rPr>
               <w:t>{X_ORIENT}</w:t>
-            </w:r>
-          </w:p>
-        </w:tc>
-        <w:tc>
-          <w:tcPr>
-            <w:tcW w:type="dxa" w:w="2635"/>
-          </w:tcPr>
-          <w:p>
-            <w:pPr>
-              <w:jc w:val="center"/>
-            </w:pPr>
-            <w:r/>
-            <w:r>
-              <w:rPr>
-                <w:b w:val="0"/>
-                <w:sz w:val="24"/>
-              </w:rPr>
-              <w:t>{X_DOC}</w:t>
-            </w:r>
-          </w:p>
-        </w:tc>
-        <w:tc>
-          <w:tcPr>
-            <w:tcW w:type="dxa" w:w="2635"/>
-          </w:tcPr>
-          <w:p>
-            <w:pPr>
-              <w:jc w:val="center"/>
-            </w:pPr>
-            <w:r/>
-            <w:r>
-              <w:rPr>
-                <w:b w:val="0"/>
-                <w:sz w:val="24"/>
-              </w:rPr>
-              <w:t>{X_OTRO}</w:t>
-            </w:r>
-          </w:p>
-          <w:p>
-            <w:pPr>
-              <w:jc w:val="center"/>
-            </w:pPr>
-            <w:r>
-              <w:rPr>
-                <w:sz w:val="16"/>
-              </w:rPr>
-              <w:t>{OTRO_CUAL}</w:t>
             </w:r>
           </w:p>
         </w:tc>
@@ -922,15 +844,82 @@
         <w:t>{DOCENTE}</w:t>
       </w:r>
     </w:p>
-    <w:p>
-      <w:r>
-        <w:rPr>
-          <w:b/>
-          <w:sz w:val="18"/>
-        </w:rPr>
-        <w:t>ROL: {ROL}</w:t>
-      </w:r>
-    </w:p>
+    <w:p/>
+    <w:tbl>
+      <w:tblPr>
+        <w:tblW w:type="auto" w:w="0"/>
+        <w:tblLook w:firstColumn="1" w:firstRow="1" w:lastColumn="0" w:lastRow="0" w:noHBand="0" w:noVBand="1" w:val="04A0"/>
+        <w:tblBorders>
+          <w:top w:val="single" w:sz="6" w:space="0" w:color="000000"/>
+          <w:left w:val="single" w:sz="6" w:space="0" w:color="000000"/>
+          <w:bottom w:val="single" w:sz="6" w:space="0" w:color="000000"/>
+          <w:right w:val="single" w:sz="6" w:space="0" w:color="000000"/>
+          <w:insideH w:val="single" w:sz="6" w:space="0" w:color="000000"/>
+          <w:insideV w:val="single" w:sz="6" w:space="0" w:color="000000"/>
+        </w:tblBorders>
+      </w:tblPr>
+      <w:tblGrid>
+        <w:gridCol w:w="10540"/>
+      </w:tblGrid>
+      <w:tr>
+        <w:tc>
+          <w:tcPr>
+            <w:tcW w:type="dxa" w:w="10540"/>
+            <w:shd w:val="clear" w:fill="D9D9D9"/>
+          </w:tcPr>
+          <w:p>
+            <w:pPr>
+              <w:jc w:val="center"/>
+            </w:pPr>
+            <w:r/>
+            <w:r>
+              <w:rPr>
+                <w:b/>
+                <w:sz w:val="18"/>
+              </w:rPr>
+              <w:t>6. RECORRIDO Y SEGUIMIENTO</w:t>
+            </w:r>
+          </w:p>
+        </w:tc>
+      </w:tr>
+    </w:tbl>
+    <w:tbl>
+      <w:tblPr>
+        <w:tblW w:type="auto" w:w="0"/>
+        <w:tblLook w:firstColumn="1" w:firstRow="1" w:lastColumn="0" w:lastRow="0" w:noHBand="0" w:noVBand="1" w:val="04A0"/>
+        <w:tblBorders>
+          <w:top w:val="single" w:sz="6" w:space="0" w:color="000000"/>
+          <w:left w:val="single" w:sz="6" w:space="0" w:color="000000"/>
+          <w:bottom w:val="single" w:sz="6" w:space="0" w:color="000000"/>
+          <w:right w:val="single" w:sz="6" w:space="0" w:color="000000"/>
+          <w:insideH w:val="single" w:sz="6" w:space="0" w:color="000000"/>
+          <w:insideV w:val="single" w:sz="6" w:space="0" w:color="000000"/>
+        </w:tblBorders>
+      </w:tblPr>
+      <w:tblGrid>
+        <w:gridCol w:w="10540"/>
+      </w:tblGrid>
+      <w:tr>
+        <w:trPr>
+          <w:trHeight w:val="800" w:hRule="atLeast"/>
+        </w:trPr>
+        <w:tc>
+          <w:tcPr>
+            <w:tcW w:type="dxa" w:w="10540"/>
+          </w:tcPr>
+          <w:p>
+            <w:r/>
+            <w:r>
+              <w:rPr>
+                <w:b w:val="0"/>
+                <w:sz w:val="18"/>
+              </w:rPr>
+              <w:t>{RECORRIDO}</w:t>
+            </w:r>
+          </w:p>
+        </w:tc>
+      </w:tr>
+    </w:tbl>
     <w:p/>
     <w:tbl>
       <w:tblPr>
@@ -961,7 +950,39 @@
                 <w:b/>
                 <w:sz w:val="18"/>
               </w:rPr>
-              <w:t>RECIBIDO POR</w:t>
+              <w:t>ESTADO</w:t>
+            </w:r>
+          </w:p>
+        </w:tc>
+        <w:tc>
+          <w:tcPr>
+            <w:tcW w:type="dxa" w:w="5270"/>
+          </w:tcPr>
+          <w:p>
+            <w:r/>
+            <w:r>
+              <w:rPr>
+                <w:b w:val="0"/>
+                <w:sz w:val="18"/>
+              </w:rPr>
+              <w:t>{ESTADO}</w:t>
+            </w:r>
+          </w:p>
+        </w:tc>
+      </w:tr>
+      <w:tr>
+        <w:tc>
+          <w:tcPr>
+            <w:tcW w:type="dxa" w:w="5270"/>
+          </w:tcPr>
+          <w:p>
+            <w:r/>
+            <w:r>
+              <w:rPr>
+                <w:b/>
+                <w:sz w:val="18"/>
+              </w:rPr>
+              <w:t>ATENDIDA POR</w:t>
             </w:r>
           </w:p>
         </w:tc>

</xml_diff>